<commit_message>
Add staff activity/debug logging and a Settings page
Adds AppLogService, a rotating flat-file log separate from ILogger, since
the Breely webhook's production behavior was otherwise invisible to staff.
Standard tier always logs definitive booking/series/club-event actions with
the real signed-in staff identity; Debug tier adds Breely webhook detail
(customer PII redacted) and staff sign-in events. A new Settings page
exposes the level toggle plus a 500-line viewer and full-log download.

Also fixes a live-found bug hit while testing this: cancelling a booking
could throw an unhandled 404 from Graph (most likely the Breely webhook
claiming/trimming the same hold out from under a stale staff view) and
crash the Blazor circuit - now tolerated as "already gone," matching the
pattern CancelSeriesAsync already used for a missing series master.

Updates the architecture doc, API reference, deployment guide, and staff
guide to match, and regenerates their .docx exports.
</commit_message>
<xml_diff>
--- a/docs/api-reference.docx
+++ b/docs/api-reference.docx
@@ -32,13 +32,24 @@
           <w:b/>
           <w:bCs/>
         </w:rPr>
-        <w:t xml:space="preserve">five</w:t>
-      </w:r>
-      <w:r>
-        <w:t xml:space="preserve"> HTTP API endpoints, and all are public/anonymous. There is no
-staff-facing REST/JSON API. Staff functionality (creating and managing bookings, club events) is
-built entirely as Blazor Server components rendered over an authenticated SignalR circuit - staff
-never call an HTTP API directly, and no such API exists to call (architecture doc §5.4, §6.2).</w:t>
+        <w:t xml:space="preserve">six</w:t>
+      </w:r>
+      <w:r>
+        <w:t xml:space="preserve"> HTTP API endpoints. Staff functionality (creating and managing bookings,
+club events) is still built almost entirely as Blazor Server components rendered over an
+authenticated SignalR circuit, not called via HTTP - but as of Phase 10 that's no longer
+</w:t>
+      </w:r>
+      <w:r>
+        <w:rPr>
+          <w:i/>
+          <w:iCs/>
+        </w:rPr>
+        <w:t xml:space="preserve">absolute</w:t>
+      </w:r>
+      <w:r>
+        <w:t xml:space="preserve">: one endpoint below exists specifically because a file download doesn't fit the SignalR
+circuit (architecture doc §5.6).</w:t>
       </w:r>
     </w:p>
     <w:p>
@@ -46,8 +57,9 @@
         <w:spacing w:after="160"/>
       </w:pPr>
       <w:r>
-        <w:t xml:space="preserve">Four of the five are read-only (three customer/member-facing, plus a staff-viewable diagnostic
-listener). The fifth, added in Phase 10, is the app's only anonymous </w:t>
+        <w:t xml:space="preserve">Five of the six are anonymous. Four of those five are read-only (three customer/member-facing, plus
+a staff-viewable diagnostic listener). The fifth anonymous endpoint, added in Phase 10, is the app's
+only anonymous </w:t>
       </w:r>
       <w:r>
         <w:rPr>
@@ -57,12 +69,12 @@
         <w:t xml:space="preserve">write</w:t>
       </w:r>
       <w:r>
-        <w:t xml:space="preserve"> surface: a webhook
-that ingests booking notifications from the Breely booking platform (architecture doc §4.8/§5.5).
-It's a deliberate, bounded exception to "public surfaces are read-only," not a broadening of the
-general rule - see </w:t>
-      </w:r>
-      <w:hyperlink w:history="1" r:id="rIdzyqtza54pqyrlqyt5cqqa">
+        <w:t xml:space="preserve"> surface: a webhook that ingests booking notifications from the Breely
+booking platform (architecture doc §4.8/§5.5). It's a deliberate, bounded exception to "public
+surfaces are read-only," not a broadening of the general rule - see
+</w:t>
+      </w:r>
+      <w:hyperlink w:history="1" r:id="rIdmbaq7od09gunwuc6lfww3">
         <w:r>
           <w:rPr>
             <w:rStyle w:val="Hyperlink"/>
@@ -79,6 +91,41 @@
         <w:spacing w:after="160"/>
       </w:pPr>
       <w:r>
+        <w:t xml:space="preserve">The sixth, also added in Phase 10, is the one </w:t>
+      </w:r>
+      <w:r>
+        <w:rPr>
+          <w:b/>
+          <w:bCs/>
+        </w:rPr>
+        <w:t xml:space="preserve">staff-authenticated</w:t>
+      </w:r>
+      <w:r>
+        <w:t xml:space="preserve"> HTTP endpoint in the app: a
+log-file download (architecture doc §5.6) - see
+</w:t>
+      </w:r>
+      <w:hyperlink w:history="1" r:id="rId3dnmn0pra8bpnmm8zdsv2">
+        <w:r>
+          <w:rPr>
+            <w:rStyle w:val="Hyperlink"/>
+          </w:rPr>
+          <w:t xml:space="preserve">GET /settings/logs/download</w:t>
+        </w:r>
+      </w:hyperlink>
+      <w:r>
+        <w:t xml:space="preserve">. Every other staff action still happens
+as a method call inside the authenticated Blazor circuit, not a distinct HTTP request; this one
+endpoint exists only because Blazor Server's SignalR circuit isn't a good way to stream a file
+download, the same reasoning that keeps the anonymous endpoints below out of the Blazor component
+tree in the first place.</w:t>
+      </w:r>
+    </w:p>
+    <w:p>
+      <w:pPr>
+        <w:spacing w:after="160"/>
+      </w:pPr>
+      <w:r>
         <w:t xml:space="preserve">This is otherwise a deliberate architectural decision, confirmed by a live incident: at one point
 </w:t>
       </w:r>
@@ -138,7 +185,7 @@
           <w:numId w:val="2"/>
         </w:numPr>
       </w:pPr>
-      <w:hyperlink w:history="1" r:id="rIdktilnsiznevmwc4tftro8">
+      <w:hyperlink w:history="1" r:id="rIdklqulgjnjreftxpha5dei">
         <w:r>
           <w:rPr>
             <w:rStyle w:val="Hyperlink"/>
@@ -149,8 +196,8 @@
         </w:r>
       </w:hyperlink>
       <w:r>
-        <w:t xml:space="preserve"> - the five real, callable HTTP endpoints. Anyone can call these
-without signing in (the webhook additionally requires a shared secret).</w:t>
+        <w:t xml:space="preserve"> - the six real, callable HTTP endpoints. Five need no sign-in
+(the webhook additionally requires a shared secret); one requires staff sign-in.</w:t>
       </w:r>
     </w:p>
     <w:p>
@@ -161,7 +208,7 @@
           <w:numId w:val="2"/>
         </w:numPr>
       </w:pPr>
-      <w:hyperlink w:history="1" r:id="rIdeherl3akxgcbi8brd5six">
+      <w:hyperlink w:history="1" r:id="rIdl-0nc49eofa7tsmthbgyx">
         <w:r>
           <w:rPr>
             <w:rStyle w:val="Hyperlink"/>
@@ -172,8 +219,8 @@
         </w:r>
       </w:hyperlink>
       <w:r>
-        <w:t xml:space="preserve"> - why there's no staff API, and how staff
-actions actually reach the server.</w:t>
+        <w:t xml:space="preserve"> - why there's (almost) no staff API, and how
+staff actions actually reach the server.</w:t>
       </w:r>
     </w:p>
     <w:p>
@@ -184,7 +231,7 @@
           <w:numId w:val="2"/>
         </w:numPr>
       </w:pPr>
-      <w:hyperlink w:history="1" r:id="rIdwspe9zmpc31yfkrcmme28">
+      <w:hyperlink w:history="1" r:id="rIdbunkaq9ghxy9o3o_oiski">
         <w:r>
           <w:rPr>
             <w:rStyle w:val="Hyperlink"/>
@@ -345,7 +392,7 @@
       <w:r>
         <w:t xml:space="preserve">) - see </w:t>
       </w:r>
-      <w:hyperlink w:history="1" r:id="rIdv4hyq9sggfpf6trrtmse1">
+      <w:hyperlink w:history="1" r:id="rIdq-nuwbk3cafegalsuay8i">
         <w:r>
           <w:rPr>
             <w:rStyle w:val="Hyperlink"/>
@@ -1698,7 +1745,7 @@
 visitors, with Month, Week, and Day views. Deliberately hand-built HTML with inline CSS/JS rather
 than a Blazor page, for the reason in </w:t>
       </w:r>
-      <w:hyperlink w:history="1" r:id="rIdapkzr3rqbvi905fmlkhuo">
+      <w:hyperlink w:history="1" r:id="rIdm0gme6op0cnypjid9rvh5">
         <w:r>
           <w:rPr>
             <w:rStyle w:val="Hyperlink"/>
@@ -2432,7 +2479,7 @@
 club's own - a known, deliberately deferred hardening item (see
 </w:t>
       </w:r>
-      <w:hyperlink w:history="1" r:id="rIdvnbbc6idqvvjtpiksddmc">
+      <w:hyperlink w:history="1" r:id="rIdxhmfohbrwic61v9mlo9lz">
         <w:r>
           <w:rPr>
             <w:rStyle w:val="Hyperlink"/>
@@ -4226,6 +4273,216 @@
     </w:p>
     <w:p>
       <w:pPr>
+        <w:pStyle w:val="Heading3"/>
+        <w:spacing w:after="120" w:before="240"/>
+      </w:pPr>
+      <w:r>
+        <w:rPr>
+          <w:rFonts w:ascii="Consolas" w:cs="Consolas" w:eastAsia="Consolas" w:hAnsi="Consolas"/>
+          <w:sz w:val="20"/>
+          <w:szCs w:val="20"/>
+          <w:highlight w:val="lightGray"/>
+          <w:highlightCs w:val="lightGray"/>
+        </w:rPr>
+        <w:t xml:space="preserve">GET /settings/logs/download</w:t>
+      </w:r>
+    </w:p>
+    <w:p>
+      <w:pPr>
+        <w:spacing w:after="160"/>
+      </w:pPr>
+      <w:r>
+        <w:t xml:space="preserve">The one staff-facing HTTP endpoint in the app (architecture doc §5.6) - built as a plain Minimal API
+endpoint rather than a Blazor page for the same "raw HTTP semantics don't fit the SignalR circuit"
+reason the anonymous endpoints above are, just gated by sign-in instead of </w:t>
+      </w:r>
+      <w:r>
+        <w:rPr>
+          <w:rFonts w:ascii="Consolas" w:cs="Consolas" w:eastAsia="Consolas" w:hAnsi="Consolas"/>
+          <w:sz w:val="20"/>
+          <w:szCs w:val="20"/>
+          <w:highlight w:val="lightGray"/>
+          <w:highlightCs w:val="lightGray"/>
+        </w:rPr>
+        <w:t xml:space="preserve">.AllowAnonymous()</w:t>
+      </w:r>
+      <w:r>
+        <w:t xml:space="preserve">.
+Backs the </w:t>
+      </w:r>
+      <w:r>
+        <w:rPr>
+          <w:b/>
+          <w:bCs/>
+        </w:rPr>
+        <w:t xml:space="preserve">Settings</w:t>
+      </w:r>
+      <w:r>
+        <w:t xml:space="preserve"> page's (</w:t>
+      </w:r>
+      <w:r>
+        <w:rPr>
+          <w:rFonts w:ascii="Consolas" w:cs="Consolas" w:eastAsia="Consolas" w:hAnsi="Consolas"/>
+          <w:sz w:val="20"/>
+          <w:szCs w:val="20"/>
+          <w:highlight w:val="lightGray"/>
+          <w:highlightCs w:val="lightGray"/>
+        </w:rPr>
+        <w:t xml:space="preserve">/settings</w:t>
+      </w:r>
+      <w:r>
+        <w:t xml:space="preserve">, architecture doc §4.9) "Download full log archive" link.</w:t>
+      </w:r>
+    </w:p>
+    <w:p>
+      <w:pPr>
+        <w:pStyle w:val="ListParagraph"/>
+        <w:numPr>
+          <w:ilvl w:val="0"/>
+          <w:numId w:val="3"/>
+        </w:numPr>
+      </w:pPr>
+      <w:r>
+        <w:rPr>
+          <w:b/>
+          <w:bCs/>
+        </w:rPr>
+        <w:t xml:space="preserve">Auth:</w:t>
+      </w:r>
+      <w:r>
+        <w:t xml:space="preserve"> staff sign-in required - covered by the app's default authenticated fallback policy
+(</w:t>
+      </w:r>
+      <w:r>
+        <w:rPr>
+          <w:rFonts w:ascii="Consolas" w:cs="Consolas" w:eastAsia="Consolas" w:hAnsi="Consolas"/>
+          <w:sz w:val="20"/>
+          <w:szCs w:val="20"/>
+          <w:highlight w:val="lightGray"/>
+          <w:highlightCs w:val="lightGray"/>
+        </w:rPr>
+        <w:t xml:space="preserve">Program.cs:64-71</w:t>
+      </w:r>
+      <w:r>
+        <w:t xml:space="preserve">), same as every other page; no separate check needed since this route was
+never marked anonymous.</w:t>
+      </w:r>
+    </w:p>
+    <w:p>
+      <w:pPr>
+        <w:pStyle w:val="ListParagraph"/>
+        <w:numPr>
+          <w:ilvl w:val="0"/>
+          <w:numId w:val="3"/>
+        </w:numPr>
+      </w:pPr>
+      <w:r>
+        <w:rPr>
+          <w:b/>
+          <w:bCs/>
+        </w:rPr>
+        <w:t xml:space="preserve">Response </w:t>
+      </w:r>
+      <w:r>
+        <w:rPr>
+          <w:rFonts w:ascii="Consolas" w:cs="Consolas" w:eastAsia="Consolas" w:hAnsi="Consolas"/>
+          <w:b/>
+          <w:bCs/>
+          <w:sz w:val="20"/>
+          <w:szCs w:val="20"/>
+          <w:highlight w:val="lightGray"/>
+          <w:highlightCs w:val="lightGray"/>
+        </w:rPr>
+        <w:t xml:space="preserve">200 OK</w:t>
+      </w:r>
+      <w:r>
+        <w:t xml:space="preserve"> - </w:t>
+      </w:r>
+      <w:r>
+        <w:rPr>
+          <w:rFonts w:ascii="Consolas" w:cs="Consolas" w:eastAsia="Consolas" w:hAnsi="Consolas"/>
+          <w:sz w:val="20"/>
+          <w:szCs w:val="20"/>
+          <w:highlight w:val="lightGray"/>
+          <w:highlightCs w:val="lightGray"/>
+        </w:rPr>
+        <w:t xml:space="preserve">application/zip</w:t>
+      </w:r>
+      <w:r>
+        <w:t xml:space="preserve">, containing every rotated log file in </w:t>
+      </w:r>
+      <w:r>
+        <w:rPr>
+          <w:rFonts w:ascii="Consolas" w:cs="Consolas" w:eastAsia="Consolas" w:hAnsi="Consolas"/>
+          <w:sz w:val="20"/>
+          <w:szCs w:val="20"/>
+          <w:highlight w:val="lightGray"/>
+          <w:highlightCs w:val="lightGray"/>
+        </w:rPr>
+        <w:t xml:space="preserve">AppLog:LogDirectory</w:t>
+      </w:r>
+      <w:r>
+        <w:t xml:space="preserve">
+(architecture doc §4.9) as separate entries, built in memory (small enough at this app's log
+volume). Filename: </w:t>
+      </w:r>
+      <w:r>
+        <w:rPr>
+          <w:rFonts w:ascii="Consolas" w:cs="Consolas" w:eastAsia="Consolas" w:hAnsi="Consolas"/>
+          <w:sz w:val="20"/>
+          <w:szCs w:val="20"/>
+          <w:highlight w:val="lightGray"/>
+          <w:highlightCs w:val="lightGray"/>
+        </w:rPr>
+        <w:t xml:space="preserve">facility-scheduler-logs-yyyy-MM-dd.zip</w:t>
+      </w:r>
+      <w:r>
+        <w:t xml:space="preserve">.</w:t>
+      </w:r>
+    </w:p>
+    <w:p>
+      <w:pPr>
+        <w:pStyle w:val="ListParagraph"/>
+        <w:numPr>
+          <w:ilvl w:val="0"/>
+          <w:numId w:val="3"/>
+        </w:numPr>
+      </w:pPr>
+      <w:r>
+        <w:rPr>
+          <w:b/>
+          <w:bCs/>
+        </w:rPr>
+        <w:t xml:space="preserve">Response </w:t>
+      </w:r>
+      <w:r>
+        <w:rPr>
+          <w:rFonts w:ascii="Consolas" w:cs="Consolas" w:eastAsia="Consolas" w:hAnsi="Consolas"/>
+          <w:b/>
+          <w:bCs/>
+          <w:sz w:val="20"/>
+          <w:szCs w:val="20"/>
+          <w:highlight w:val="lightGray"/>
+          <w:highlightCs w:val="lightGray"/>
+        </w:rPr>
+        <w:t xml:space="preserve">404</w:t>
+      </w:r>
+      <w:r>
+        <w:t xml:space="preserve"> - no log files exist yet (e.g. immediately after a fresh deploy with nothing
+logged).</w:t>
+      </w:r>
+    </w:p>
+    <w:p/>
+    <w:p>
+      <w:pPr>
+        <w:pBdr>
+          <w:bottom w:val="single" w:color="AAAAAA" w:sz="6"/>
+        </w:pBdr>
+        <w:spacing w:after="200"/>
+      </w:pPr>
+    </w:p>
+    <w:p>
+      <w:pPr>
         <w:pStyle w:val="Heading2"/>
         <w:spacing w:after="120" w:before="240"/>
       </w:pPr>
@@ -4238,7 +4495,8 @@
         <w:spacing w:after="160"/>
       </w:pPr>
       <w:r>
-        <w:t xml:space="preserve">There is no staff API to call. Staff sign in via Entra ID (</w:t>
+        <w:t xml:space="preserve">Aside from the one exception directly above, there is no staff API to call. Staff sign in via Entra
+ID (</w:t>
       </w:r>
       <w:r>
         <w:rPr>
@@ -4251,9 +4509,8 @@
         <w:t xml:space="preserve">Program.cs:56-62</w:t>
       </w:r>
       <w:r>
-        <w:t xml:space="preserve">) and interact entirely
-through Blazor Server pages - every page except the three public endpoints above requires
-authentication by default (</w:t>
+        <w:t xml:space="preserve">) and interact entirely through Blazor Server pages - every page except the
+public endpoints above requires authentication by default (</w:t>
       </w:r>
       <w:r>
         <w:rPr>
@@ -4279,10 +4536,9 @@
         <w:t xml:space="preserve">Program.cs:64-71</w:t>
       </w:r>
       <w:r>
-        <w:t xml:space="preserve">).
-Guest-vs-member-vs-any-authenticated-user access is controlled entirely by the Entra Enterprise
-Application's "Assignment required?" setting, not by any code in this app (see the deployment guide's
-§1.2 for how to restrict it).</w:t>
+        <w:t xml:space="preserve">). Guest-vs-member-vs-any-authenticated-user access is
+controlled entirely by the Entra Enterprise Application's "Assignment required?" setting, not by any
+code in this app (see the deployment guide's §1.2 for how to restrict it).</w:t>
       </w:r>
     </w:p>
     <w:p>
@@ -4290,8 +4546,8 @@
         <w:spacing w:after="160"/>
       </w:pPr>
       <w:r>
-        <w:t xml:space="preserve">Because everything runs over one shared, authenticated SignalR circuit, there's no meaningful sense
-in which a staff "request" has its own URL, verb, or independent auth check the way the three public
+        <w:t xml:space="preserve">Because everything else runs over one shared, authenticated SignalR circuit, there's no meaningful
+sense in which a staff "request" has its own URL, verb, or independent auth check the way the public
 endpoints do - a page load establishes the circuit, and every subsequent staff action (create a
 booking, cancel a series, etc.) is a method call within that same already-authenticated circuit, not
 a new HTTP request.</w:t>
@@ -4506,7 +4762,7 @@
                 <w:highlight w:val="lightGray"/>
                 <w:highlightCs w:val="lightGray"/>
               </w:rPr>
-              <w:t xml:space="preserve">Task&lt;BookingResult&gt; CreateHoldAsync(SheetBooking booking)</w:t>
+              <w:t xml:space="preserve">Task&lt;BookingResult&gt; CreateHoldAsync(SheetBooking booking, string actingUser)</w:t>
             </w:r>
           </w:p>
         </w:tc>
@@ -4547,7 +4803,33 @@
               <w:t xml:space="preserve">BookingResult.Conflict</w:t>
             </w:r>
             <w:r>
-              <w:t xml:space="preserve"> (no write) if anything overlaps.</w:t>
+              <w:t xml:space="preserve"> (no write) if anything overlaps. Logs </w:t>
+            </w:r>
+            <w:r>
+              <w:rPr>
+                <w:rFonts w:ascii="Consolas" w:cs="Consolas" w:eastAsia="Consolas" w:hAnsi="Consolas"/>
+                <w:sz w:val="20"/>
+                <w:szCs w:val="20"/>
+                <w:highlight w:val="lightGray"/>
+                <w:highlightCs w:val="lightGray"/>
+              </w:rPr>
+              <w:t xml:space="preserve">BookingCreated</w:t>
+            </w:r>
+            <w:r>
+              <w:t xml:space="preserve"> on success (</w:t>
+            </w:r>
+            <w:r>
+              <w:rPr>
+                <w:rFonts w:ascii="Consolas" w:cs="Consolas" w:eastAsia="Consolas" w:hAnsi="Consolas"/>
+                <w:sz w:val="20"/>
+                <w:szCs w:val="20"/>
+                <w:highlight w:val="lightGray"/>
+                <w:highlightCs w:val="lightGray"/>
+              </w:rPr>
+              <w:t xml:space="preserve">actingUser</w:t>
+            </w:r>
+            <w:r>
+              <w:t xml:space="preserve">, architecture doc §4.9).</w:t>
             </w:r>
           </w:p>
         </w:tc>
@@ -4593,7 +4875,7 @@
                 <w:highlight w:val="lightGray"/>
                 <w:highlightCs w:val="lightGray"/>
               </w:rPr>
-              <w:t xml:space="preserve">Task&lt;BookingResult&gt; CreateConfirmedAsync(SheetBooking booking)</w:t>
+              <w:t xml:space="preserve">Task&lt;BookingResult&gt; CreateConfirmedAsync(SheetBooking booking, string actingUser)</w:t>
             </w:r>
           </w:p>
         </w:tc>
@@ -4667,7 +4949,7 @@
                 <w:highlight w:val="lightGray"/>
                 <w:highlightCs w:val="lightGray"/>
               </w:rPr>
-              <w:t xml:space="preserve">Task&lt;GroupBookingResult&gt; CreateAcrossSheetsAsync(IEnumerable&lt;string&gt; sheetMailboxes, SheetBooking template)</w:t>
+              <w:t xml:space="preserve">Task&lt;GroupBookingResult&gt; CreateAcrossSheetsAsync(IEnumerable&lt;string&gt; sheetMailboxes, SheetBooking template, string actingUser)</w:t>
             </w:r>
           </w:p>
         </w:tc>
@@ -4741,7 +5023,7 @@
                 <w:highlight w:val="lightGray"/>
                 <w:highlightCs w:val="lightGray"/>
               </w:rPr>
-              <w:t xml:space="preserve">Task&lt;SheetBooking&gt; ConfirmAsync(string sheetMailbox, string eventId)</w:t>
+              <w:t xml:space="preserve">Task&lt;SheetBooking&gt; ConfirmAsync(string sheetMailbox, string eventId, string actingUser)</w:t>
             </w:r>
           </w:p>
         </w:tc>
@@ -4815,22 +5097,48 @@
                 <w:highlight w:val="lightGray"/>
                 <w:highlightCs w:val="lightGray"/>
               </w:rPr>
-              <w:t xml:space="preserve">Task CancelAsync(string sheetMailbox, string eventId)</w:t>
-            </w:r>
-          </w:p>
-        </w:tc>
-        <w:tc>
-          <w:tcPr>
-            <w:tcMar>
-              <w:top w:type="dxa" w:w="60"/>
-              <w:left w:type="dxa" w:w="80"/>
-              <w:bottom w:type="dxa" w:w="60"/>
-              <w:right w:type="dxa" w:w="80"/>
-            </w:tcMar>
-          </w:tcPr>
-          <w:p>
-            <w:r>
-              <w:t xml:space="preserve">Hard-deletes a single event.</w:t>
+              <w:t xml:space="preserve">Task CancelAsync(string sheetMailbox, string eventId, string actingUser)</w:t>
+            </w:r>
+          </w:p>
+        </w:tc>
+        <w:tc>
+          <w:tcPr>
+            <w:tcMar>
+              <w:top w:type="dxa" w:w="60"/>
+              <w:left w:type="dxa" w:w="80"/>
+              <w:bottom w:type="dxa" w:w="60"/>
+              <w:right w:type="dxa" w:w="80"/>
+            </w:tcMar>
+          </w:tcPr>
+          <w:p>
+            <w:r>
+              <w:t xml:space="preserve">Hard-deletes a single event. Tolerates a </w:t>
+            </w:r>
+            <w:r>
+              <w:rPr>
+                <w:rFonts w:ascii="Consolas" w:cs="Consolas" w:eastAsia="Consolas" w:hAnsi="Consolas"/>
+                <w:sz w:val="20"/>
+                <w:szCs w:val="20"/>
+                <w:highlight w:val="lightGray"/>
+                <w:highlightCs w:val="lightGray"/>
+              </w:rPr>
+              <w:t xml:space="preserve">404</w:t>
+            </w:r>
+            <w:r>
+              <w:t xml:space="preserve"> from Graph as "already gone" (e.g. the Breely webhook already claimed/trimmed it) rather than throwing (architecture doc D37) - logged at Debug tier as a no-op in that case, </w:t>
+            </w:r>
+            <w:r>
+              <w:rPr>
+                <w:rFonts w:ascii="Consolas" w:cs="Consolas" w:eastAsia="Consolas" w:hAnsi="Consolas"/>
+                <w:sz w:val="20"/>
+                <w:szCs w:val="20"/>
+                <w:highlight w:val="lightGray"/>
+                <w:highlightCs w:val="lightGray"/>
+              </w:rPr>
+              <w:t xml:space="preserve">BookingCancelled</w:t>
+            </w:r>
+            <w:r>
+              <w:t xml:space="preserve"> at Standard tier otherwise.</w:t>
             </w:r>
           </w:p>
         </w:tc>
@@ -4876,7 +5184,7 @@
                 <w:highlight w:val="lightGray"/>
                 <w:highlightCs w:val="lightGray"/>
               </w:rPr>
-              <w:t xml:space="preserve">Task&lt;GroupBookingResult&gt; UpdateGroupAsync(IEnumerable&lt;SheetBooking&gt; members, SheetBooking updatedFields, Guid? newBookingGroupId = null)</w:t>
+              <w:t xml:space="preserve">Task&lt;GroupBookingResult&gt; UpdateGroupAsync(IEnumerable&lt;SheetBooking&gt; members, SheetBooking updatedFields, string actingUser, Guid? newBookingGroupId = null)</w:t>
             </w:r>
           </w:p>
         </w:tc>
@@ -4950,7 +5258,7 @@
                 <w:highlight w:val="lightGray"/>
                 <w:highlightCs w:val="lightGray"/>
               </w:rPr>
-              <w:t xml:space="preserve">Task CancelGroupAsync(IEnumerable&lt;SheetBooking&gt; members, bool reopenAsGroupEventHold)</w:t>
+              <w:t xml:space="preserve">Task CancelGroupAsync(IEnumerable&lt;SheetBooking&gt; members, bool reopenAsGroupEventHold, string actingUser)</w:t>
             </w:r>
           </w:p>
         </w:tc>
@@ -4978,7 +5286,20 @@
               <w:t xml:space="preserve">reopenAsGroupEventHold: true</w:t>
             </w:r>
             <w:r>
-              <w:t xml:space="preserve"> converts each slot back to an unclaimed open Group Event hold (publicly bookable again) instead of deleting it.</w:t>
+              <w:t xml:space="preserve"> converts each slot back to an unclaimed open Group Event hold (publicly bookable again) instead of deleting it. Same per-member 404-tolerance as </w:t>
+            </w:r>
+            <w:r>
+              <w:rPr>
+                <w:rFonts w:ascii="Consolas" w:cs="Consolas" w:eastAsia="Consolas" w:hAnsi="Consolas"/>
+                <w:sz w:val="20"/>
+                <w:szCs w:val="20"/>
+                <w:highlight w:val="lightGray"/>
+                <w:highlightCs w:val="lightGray"/>
+              </w:rPr>
+              <w:t xml:space="preserve">CancelAsync</w:t>
+            </w:r>
+            <w:r>
+              <w:t xml:space="preserve"> (D37) - one member already being gone doesn't abort the rest of the group.</w:t>
             </w:r>
           </w:p>
         </w:tc>
@@ -5085,7 +5406,7 @@
                 <w:highlight w:val="lightGray"/>
                 <w:highlightCs w:val="lightGray"/>
               </w:rPr>
-              <w:t xml:space="preserve">Task&lt;List&lt;SheetBooking&gt;&gt; CreateSeriesAsync(IEnumerable&lt;string&gt; sheetMailboxes, SheetBooking template, DateTime lastOccurrenceDate, IEnumerable&lt;DateTime&gt; excludedDates)</w:t>
+              <w:t xml:space="preserve">Task&lt;List&lt;SheetBooking&gt;&gt; CreateSeriesAsync(IEnumerable&lt;string&gt; sheetMailboxes, SheetBooking template, DateTime lastOccurrenceDate, IEnumerable&lt;DateTime&gt; excludedDates, string actingUser)</w:t>
             </w:r>
           </w:p>
         </w:tc>
@@ -5185,22 +5506,61 @@
                 <w:highlight w:val="lightGray"/>
                 <w:highlightCs w:val="lightGray"/>
               </w:rPr>
-              <w:t xml:space="preserve">Task CancelSeriesAsync(IEnumerable&lt;SheetBooking&gt; members)</w:t>
-            </w:r>
-          </w:p>
-        </w:tc>
-        <w:tc>
-          <w:tcPr>
-            <w:tcMar>
-              <w:top w:type="dxa" w:w="60"/>
-              <w:left w:type="dxa" w:w="80"/>
-              <w:bottom w:type="dxa" w:w="60"/>
-              <w:right w:type="dxa" w:w="80"/>
-            </w:tcMar>
-          </w:tcPr>
-          <w:p>
-            <w:r>
-              <w:t xml:space="preserve">Deletes an entire recurring series (all occurrences) for every sheet in the group - the "backdoor" for correcting a data-entry mistake at series creation, not a primary UX path.</w:t>
+              <w:t xml:space="preserve">Task CancelSeriesAsync(IEnumerable&lt;SheetBooking&gt; members, string actingUser)</w:t>
+            </w:r>
+          </w:p>
+        </w:tc>
+        <w:tc>
+          <w:tcPr>
+            <w:tcMar>
+              <w:top w:type="dxa" w:w="60"/>
+              <w:left w:type="dxa" w:w="80"/>
+              <w:bottom w:type="dxa" w:w="60"/>
+              <w:right w:type="dxa" w:w="80"/>
+            </w:tcMar>
+          </w:tcPr>
+          <w:p>
+            <w:r>
+              <w:t xml:space="preserve">Deletes an entire recurring series (all occurrences) for every sheet in the group - the "backdoor" for correcting a data-entry mistake at series creation, not a primary UX path. Already tolerated a missing series master (</w:t>
+            </w:r>
+            <w:r>
+              <w:rPr>
+                <w:rFonts w:ascii="Consolas" w:cs="Consolas" w:eastAsia="Consolas" w:hAnsi="Consolas"/>
+                <w:sz w:val="20"/>
+                <w:szCs w:val="20"/>
+                <w:highlight w:val="lightGray"/>
+                <w:highlightCs w:val="lightGray"/>
+              </w:rPr>
+              <w:t xml:space="preserve">404</w:t>
+            </w:r>
+            <w:r>
+              <w:t xml:space="preserve">) before Phase 10 - the pattern </w:t>
+            </w:r>
+            <w:r>
+              <w:rPr>
+                <w:rFonts w:ascii="Consolas" w:cs="Consolas" w:eastAsia="Consolas" w:hAnsi="Consolas"/>
+                <w:sz w:val="20"/>
+                <w:szCs w:val="20"/>
+                <w:highlight w:val="lightGray"/>
+                <w:highlightCs w:val="lightGray"/>
+              </w:rPr>
+              <w:t xml:space="preserve">CancelAsync</w:t>
+            </w:r>
+            <w:r>
+              <w:t xml:space="preserve">/</w:t>
+            </w:r>
+            <w:r>
+              <w:rPr>
+                <w:rFonts w:ascii="Consolas" w:cs="Consolas" w:eastAsia="Consolas" w:hAnsi="Consolas"/>
+                <w:sz w:val="20"/>
+                <w:szCs w:val="20"/>
+                <w:highlight w:val="lightGray"/>
+                <w:highlightCs w:val="lightGray"/>
+              </w:rPr>
+              <w:t xml:space="preserve">CancelGroupAsync</w:t>
+            </w:r>
+            <w:r>
+              <w:t xml:space="preserve"> above now also follow.</w:t>
             </w:r>
           </w:p>
         </w:tc>
@@ -5762,22 +6122,35 @@
                 <w:highlight w:val="lightGray"/>
                 <w:highlightCs w:val="lightGray"/>
               </w:rPr>
-              <w:t xml:space="preserve">Task&lt;ClubEvent&gt; CreateAsync(ClubEvent clubEvent)</w:t>
-            </w:r>
-          </w:p>
-        </w:tc>
-        <w:tc>
-          <w:tcPr>
-            <w:tcMar>
-              <w:top w:type="dxa" w:w="60"/>
-              <w:left w:type="dxa" w:w="80"/>
-              <w:bottom w:type="dxa" w:w="60"/>
-              <w:right w:type="dxa" w:w="80"/>
-            </w:tcMar>
-          </w:tcPr>
-          <w:p>
-            <w:r>
-              <w:t xml:space="preserve">Creates a club event. No conflict check.</w:t>
+              <w:t xml:space="preserve">Task&lt;ClubEvent&gt; CreateAsync(ClubEvent clubEvent, string actingUser)</w:t>
+            </w:r>
+          </w:p>
+        </w:tc>
+        <w:tc>
+          <w:tcPr>
+            <w:tcMar>
+              <w:top w:type="dxa" w:w="60"/>
+              <w:left w:type="dxa" w:w="80"/>
+              <w:bottom w:type="dxa" w:w="60"/>
+              <w:right w:type="dxa" w:w="80"/>
+            </w:tcMar>
+          </w:tcPr>
+          <w:p>
+            <w:r>
+              <w:t xml:space="preserve">Creates a club event. No conflict check. Logs </w:t>
+            </w:r>
+            <w:r>
+              <w:rPr>
+                <w:rFonts w:ascii="Consolas" w:cs="Consolas" w:eastAsia="Consolas" w:hAnsi="Consolas"/>
+                <w:sz w:val="20"/>
+                <w:szCs w:val="20"/>
+                <w:highlight w:val="lightGray"/>
+                <w:highlightCs w:val="lightGray"/>
+              </w:rPr>
+              <w:t xml:space="preserve">ClubEventCreated</w:t>
+            </w:r>
+            <w:r>
+              <w:t xml:space="preserve"> on success (architecture doc §4.9).</w:t>
             </w:r>
           </w:p>
         </w:tc>
@@ -5823,7 +6196,7 @@
                 <w:highlight w:val="lightGray"/>
                 <w:highlightCs w:val="lightGray"/>
               </w:rPr>
-              <w:t xml:space="preserve">Task UpdateAsync(ClubEvent clubEvent)</w:t>
+              <w:t xml:space="preserve">Task UpdateAsync(ClubEvent clubEvent, string actingUser)</w:t>
             </w:r>
           </w:p>
         </w:tc>
@@ -5897,7 +6270,7 @@
                 <w:highlight w:val="lightGray"/>
                 <w:highlightCs w:val="lightGray"/>
               </w:rPr>
-              <w:t xml:space="preserve">Task CancelAsync(string eventId)</w:t>
+              <w:t xml:space="preserve">Task CancelAsync(string eventId, string actingUser)</w:t>
             </w:r>
           </w:p>
         </w:tc>
@@ -7214,6 +7587,732 @@
       <w:r>
         <w:t xml:space="preserve">) so a misconfigured
 deployment fails immediately rather than on first request.</w:t>
+      </w:r>
+    </w:p>
+    <w:p>
+      <w:pPr>
+        <w:pStyle w:val="Heading3"/>
+        <w:spacing w:after="120" w:before="240"/>
+      </w:pPr>
+      <w:r>
+        <w:rPr>
+          <w:rFonts w:ascii="Consolas" w:cs="Consolas" w:eastAsia="Consolas" w:hAnsi="Consolas"/>
+          <w:sz w:val="20"/>
+          <w:szCs w:val="20"/>
+          <w:highlight w:val="lightGray"/>
+          <w:highlightCs w:val="lightGray"/>
+        </w:rPr>
+        <w:t xml:space="preserve">AppLogService</w:t>
+      </w:r>
+    </w:p>
+    <w:p>
+      <w:pPr>
+        <w:spacing w:after="160"/>
+      </w:pPr>
+      <w:r>
+        <w:t xml:space="preserve">Added in Phase 10 (architecture doc §4.9) - the app-level activity/debug log backing the Settings
+page, deliberately separate from the framework's own </w:t>
+      </w:r>
+      <w:r>
+        <w:rPr>
+          <w:rFonts w:ascii="Consolas" w:cs="Consolas" w:eastAsia="Consolas" w:hAnsi="Consolas"/>
+          <w:sz w:val="20"/>
+          <w:szCs w:val="20"/>
+          <w:highlight w:val="lightGray"/>
+          <w:highlightCs w:val="lightGray"/>
+        </w:rPr>
+        <w:t xml:space="preserve">ILogger</w:t>
+      </w:r>
+      <w:r>
+        <w:t xml:space="preserve">. Every service above that writes to
+Graph calls into this one after a successful write.</w:t>
+      </w:r>
+    </w:p>
+    <w:tbl>
+      <w:tblPr>
+        <w:tblW w:type="pct" w:w="100%"/>
+        <w:tblBorders>
+          <w:top w:val="single" w:color="AAAAAA" w:sz="2"/>
+          <w:left w:val="single" w:color="AAAAAA" w:sz="2"/>
+          <w:bottom w:val="single" w:color="AAAAAA" w:sz="2"/>
+          <w:right w:val="single" w:color="AAAAAA" w:sz="2"/>
+          <w:insideH w:val="single" w:color="DDDDDD" w:sz="2"/>
+          <w:insideV w:val="single" w:color="DDDDDD" w:sz="2"/>
+        </w:tblBorders>
+      </w:tblPr>
+      <w:tblGrid>
+        <w:gridCol w:w="100"/>
+        <w:gridCol w:w="100"/>
+        <w:gridCol w:w="100"/>
+      </w:tblGrid>
+      <w:tr>
+        <w:trPr>
+          <w:tblHeader/>
+        </w:trPr>
+        <w:tc>
+          <w:tcPr>
+            <w:tcMar>
+              <w:top w:type="dxa" w:w="60"/>
+              <w:left w:type="dxa" w:w="80"/>
+              <w:bottom w:type="dxa" w:w="60"/>
+              <w:right w:type="dxa" w:w="80"/>
+            </w:tcMar>
+          </w:tcPr>
+          <w:p>
+            <w:r>
+              <w:rPr>
+                <w:b/>
+                <w:bCs/>
+              </w:rPr>
+              <w:t xml:space="preserve">Method</w:t>
+            </w:r>
+          </w:p>
+        </w:tc>
+        <w:tc>
+          <w:tcPr>
+            <w:tcMar>
+              <w:top w:type="dxa" w:w="60"/>
+              <w:left w:type="dxa" w:w="80"/>
+              <w:bottom w:type="dxa" w:w="60"/>
+              <w:right w:type="dxa" w:w="80"/>
+            </w:tcMar>
+          </w:tcPr>
+          <w:p>
+            <w:r>
+              <w:rPr>
+                <w:b/>
+                <w:bCs/>
+              </w:rPr>
+              <w:t xml:space="preserve">Signature</w:t>
+            </w:r>
+          </w:p>
+        </w:tc>
+        <w:tc>
+          <w:tcPr>
+            <w:tcMar>
+              <w:top w:type="dxa" w:w="60"/>
+              <w:left w:type="dxa" w:w="80"/>
+              <w:bottom w:type="dxa" w:w="60"/>
+              <w:right w:type="dxa" w:w="80"/>
+            </w:tcMar>
+          </w:tcPr>
+          <w:p>
+            <w:r>
+              <w:rPr>
+                <w:b/>
+                <w:bCs/>
+              </w:rPr>
+              <w:t xml:space="preserve">Behavior</w:t>
+            </w:r>
+          </w:p>
+        </w:tc>
+      </w:tr>
+      <w:tr>
+        <w:tc>
+          <w:tcPr>
+            <w:tcMar>
+              <w:top w:type="dxa" w:w="60"/>
+              <w:left w:type="dxa" w:w="80"/>
+              <w:bottom w:type="dxa" w:w="60"/>
+              <w:right w:type="dxa" w:w="80"/>
+            </w:tcMar>
+          </w:tcPr>
+          <w:p>
+            <w:r>
+              <w:rPr>
+                <w:rFonts w:ascii="Consolas" w:cs="Consolas" w:eastAsia="Consolas" w:hAnsi="Consolas"/>
+                <w:sz w:val="20"/>
+                <w:szCs w:val="20"/>
+                <w:highlight w:val="lightGray"/>
+                <w:highlightCs w:val="lightGray"/>
+              </w:rPr>
+              <w:t xml:space="preserve">LogActionAsync</w:t>
+            </w:r>
+          </w:p>
+        </w:tc>
+        <w:tc>
+          <w:tcPr>
+            <w:tcMar>
+              <w:top w:type="dxa" w:w="60"/>
+              <w:left w:type="dxa" w:w="80"/>
+              <w:bottom w:type="dxa" w:w="60"/>
+              <w:right w:type="dxa" w:w="80"/>
+            </w:tcMar>
+          </w:tcPr>
+          <w:p>
+            <w:r>
+              <w:rPr>
+                <w:rFonts w:ascii="Consolas" w:cs="Consolas" w:eastAsia="Consolas" w:hAnsi="Consolas"/>
+                <w:sz w:val="20"/>
+                <w:szCs w:val="20"/>
+                <w:highlight w:val="lightGray"/>
+                <w:highlightCs w:val="lightGray"/>
+              </w:rPr>
+              <w:t xml:space="preserve">Task LogActionAsync(string action, string actor, string? eventId = null, string? sheet = null, string? details = null, CancellationToken ct = default)</w:t>
+            </w:r>
+          </w:p>
+        </w:tc>
+        <w:tc>
+          <w:tcPr>
+            <w:tcMar>
+              <w:top w:type="dxa" w:w="60"/>
+              <w:left w:type="dxa" w:w="80"/>
+              <w:bottom w:type="dxa" w:w="60"/>
+              <w:right w:type="dxa" w:w="80"/>
+            </w:tcMar>
+          </w:tcPr>
+          <w:p>
+            <w:r>
+              <w:t xml:space="preserve">Standard tier - always written. Used for definitive actions (booking/series/club-event created, edited, canceled).</w:t>
+            </w:r>
+          </w:p>
+        </w:tc>
+      </w:tr>
+      <w:tr>
+        <w:tc>
+          <w:tcPr>
+            <w:tcMar>
+              <w:top w:type="dxa" w:w="60"/>
+              <w:left w:type="dxa" w:w="80"/>
+              <w:bottom w:type="dxa" w:w="60"/>
+              <w:right w:type="dxa" w:w="80"/>
+            </w:tcMar>
+          </w:tcPr>
+          <w:p>
+            <w:r>
+              <w:rPr>
+                <w:rFonts w:ascii="Consolas" w:cs="Consolas" w:eastAsia="Consolas" w:hAnsi="Consolas"/>
+                <w:sz w:val="20"/>
+                <w:szCs w:val="20"/>
+                <w:highlight w:val="lightGray"/>
+                <w:highlightCs w:val="lightGray"/>
+              </w:rPr>
+              <w:t xml:space="preserve">LogSecurityAsync</w:t>
+            </w:r>
+          </w:p>
+        </w:tc>
+        <w:tc>
+          <w:tcPr>
+            <w:tcMar>
+              <w:top w:type="dxa" w:w="60"/>
+              <w:left w:type="dxa" w:w="80"/>
+              <w:bottom w:type="dxa" w:w="60"/>
+              <w:right w:type="dxa" w:w="80"/>
+            </w:tcMar>
+          </w:tcPr>
+          <w:p>
+            <w:r>
+              <w:rPr>
+                <w:rFonts w:ascii="Consolas" w:cs="Consolas" w:eastAsia="Consolas" w:hAnsi="Consolas"/>
+                <w:sz w:val="20"/>
+                <w:szCs w:val="20"/>
+                <w:highlight w:val="lightGray"/>
+                <w:highlightCs w:val="lightGray"/>
+              </w:rPr>
+              <w:t xml:space="preserve">Task LogSecurityAsync(string action, string actor, string? details = null, CancellationToken ct = default)</w:t>
+            </w:r>
+          </w:p>
+        </w:tc>
+        <w:tc>
+          <w:tcPr>
+            <w:tcMar>
+              <w:top w:type="dxa" w:w="60"/>
+              <w:left w:type="dxa" w:w="80"/>
+              <w:bottom w:type="dxa" w:w="60"/>
+              <w:right w:type="dxa" w:w="80"/>
+            </w:tcMar>
+          </w:tcPr>
+          <w:p>
+            <w:r>
+              <w:t xml:space="preserve">Standard tier - always written. Used for security-relevant events regardless of level, e.g. a failed webhook secret check.</w:t>
+            </w:r>
+          </w:p>
+        </w:tc>
+      </w:tr>
+      <w:tr>
+        <w:tc>
+          <w:tcPr>
+            <w:tcMar>
+              <w:top w:type="dxa" w:w="60"/>
+              <w:left w:type="dxa" w:w="80"/>
+              <w:bottom w:type="dxa" w:w="60"/>
+              <w:right w:type="dxa" w:w="80"/>
+            </w:tcMar>
+          </w:tcPr>
+          <w:p>
+            <w:r>
+              <w:rPr>
+                <w:rFonts w:ascii="Consolas" w:cs="Consolas" w:eastAsia="Consolas" w:hAnsi="Consolas"/>
+                <w:sz w:val="20"/>
+                <w:szCs w:val="20"/>
+                <w:highlight w:val="lightGray"/>
+                <w:highlightCs w:val="lightGray"/>
+              </w:rPr>
+              <w:t xml:space="preserve">LogDebugAsync</w:t>
+            </w:r>
+          </w:p>
+        </w:tc>
+        <w:tc>
+          <w:tcPr>
+            <w:tcMar>
+              <w:top w:type="dxa" w:w="60"/>
+              <w:left w:type="dxa" w:w="80"/>
+              <w:bottom w:type="dxa" w:w="60"/>
+              <w:right w:type="dxa" w:w="80"/>
+            </w:tcMar>
+          </w:tcPr>
+          <w:p>
+            <w:r>
+              <w:rPr>
+                <w:rFonts w:ascii="Consolas" w:cs="Consolas" w:eastAsia="Consolas" w:hAnsi="Consolas"/>
+                <w:sz w:val="20"/>
+                <w:szCs w:val="20"/>
+                <w:highlight w:val="lightGray"/>
+                <w:highlightCs w:val="lightGray"/>
+              </w:rPr>
+              <w:t xml:space="preserve">Task LogDebugAsync(string action, string actor, string? eventId = null, string? sheet = null, string? details = null, CancellationToken ct = default)</w:t>
+            </w:r>
+          </w:p>
+        </w:tc>
+        <w:tc>
+          <w:tcPr>
+            <w:tcMar>
+              <w:top w:type="dxa" w:w="60"/>
+              <w:left w:type="dxa" w:w="80"/>
+              <w:bottom w:type="dxa" w:w="60"/>
+              <w:right w:type="dxa" w:w="80"/>
+            </w:tcMar>
+          </w:tcPr>
+          <w:p>
+            <w:r>
+              <w:t xml:space="preserve">Debug tier - a no-op unless the current level is Debug.</w:t>
+            </w:r>
+          </w:p>
+        </w:tc>
+      </w:tr>
+      <w:tr>
+        <w:tc>
+          <w:tcPr>
+            <w:tcMar>
+              <w:top w:type="dxa" w:w="60"/>
+              <w:left w:type="dxa" w:w="80"/>
+              <w:bottom w:type="dxa" w:w="60"/>
+              <w:right w:type="dxa" w:w="80"/>
+            </w:tcMar>
+          </w:tcPr>
+          <w:p>
+            <w:r>
+              <w:rPr>
+                <w:rFonts w:ascii="Consolas" w:cs="Consolas" w:eastAsia="Consolas" w:hAnsi="Consolas"/>
+                <w:sz w:val="20"/>
+                <w:szCs w:val="20"/>
+                <w:highlight w:val="lightGray"/>
+                <w:highlightCs w:val="lightGray"/>
+              </w:rPr>
+              <w:t xml:space="preserve">SetLevelAsync</w:t>
+            </w:r>
+          </w:p>
+        </w:tc>
+        <w:tc>
+          <w:tcPr>
+            <w:tcMar>
+              <w:top w:type="dxa" w:w="60"/>
+              <w:left w:type="dxa" w:w="80"/>
+              <w:bottom w:type="dxa" w:w="60"/>
+              <w:right w:type="dxa" w:w="80"/>
+            </w:tcMar>
+          </w:tcPr>
+          <w:p>
+            <w:r>
+              <w:rPr>
+                <w:rFonts w:ascii="Consolas" w:cs="Consolas" w:eastAsia="Consolas" w:hAnsi="Consolas"/>
+                <w:sz w:val="20"/>
+                <w:szCs w:val="20"/>
+                <w:highlight w:val="lightGray"/>
+                <w:highlightCs w:val="lightGray"/>
+              </w:rPr>
+              <w:t xml:space="preserve">Task SetLevelAsync(AppLogLevel level, CancellationToken ct = default)</w:t>
+            </w:r>
+          </w:p>
+        </w:tc>
+        <w:tc>
+          <w:tcPr>
+            <w:tcMar>
+              <w:top w:type="dxa" w:w="60"/>
+              <w:left w:type="dxa" w:w="80"/>
+              <w:bottom w:type="dxa" w:w="60"/>
+              <w:right w:type="dxa" w:w="80"/>
+            </w:tcMar>
+          </w:tcPr>
+          <w:p>
+            <w:r>
+              <w:t xml:space="preserve">Called by the Settings page. Updates the in-memory level immediately and persists it to a marker file in the log directory, so it survives a restart without a redeploy.</w:t>
+            </w:r>
+          </w:p>
+        </w:tc>
+      </w:tr>
+      <w:tr>
+        <w:tc>
+          <w:tcPr>
+            <w:tcMar>
+              <w:top w:type="dxa" w:w="60"/>
+              <w:left w:type="dxa" w:w="80"/>
+              <w:bottom w:type="dxa" w:w="60"/>
+              <w:right w:type="dxa" w:w="80"/>
+            </w:tcMar>
+          </w:tcPr>
+          <w:p>
+            <w:r>
+              <w:rPr>
+                <w:rFonts w:ascii="Consolas" w:cs="Consolas" w:eastAsia="Consolas" w:hAnsi="Consolas"/>
+                <w:sz w:val="20"/>
+                <w:szCs w:val="20"/>
+                <w:highlight w:val="lightGray"/>
+                <w:highlightCs w:val="lightGray"/>
+              </w:rPr>
+              <w:t xml:space="preserve">TailAsync</w:t>
+            </w:r>
+          </w:p>
+        </w:tc>
+        <w:tc>
+          <w:tcPr>
+            <w:tcMar>
+              <w:top w:type="dxa" w:w="60"/>
+              <w:left w:type="dxa" w:w="80"/>
+              <w:bottom w:type="dxa" w:w="60"/>
+              <w:right w:type="dxa" w:w="80"/>
+            </w:tcMar>
+          </w:tcPr>
+          <w:p>
+            <w:r>
+              <w:rPr>
+                <w:rFonts w:ascii="Consolas" w:cs="Consolas" w:eastAsia="Consolas" w:hAnsi="Consolas"/>
+                <w:sz w:val="20"/>
+                <w:szCs w:val="20"/>
+                <w:highlight w:val="lightGray"/>
+                <w:highlightCs w:val="lightGray"/>
+              </w:rPr>
+              <w:t xml:space="preserve">Task&lt;List&lt;string&gt;&gt; TailAsync(int count, CancellationToken ct = default)</w:t>
+            </w:r>
+          </w:p>
+        </w:tc>
+        <w:tc>
+          <w:tcPr>
+            <w:tcMar>
+              <w:top w:type="dxa" w:w="60"/>
+              <w:left w:type="dxa" w:w="80"/>
+              <w:bottom w:type="dxa" w:w="60"/>
+              <w:right w:type="dxa" w:w="80"/>
+            </w:tcMar>
+          </w:tcPr>
+          <w:p>
+            <w:r>
+              <w:t xml:space="preserve">Returns up to </w:t>
+            </w:r>
+            <w:r>
+              <w:rPr>
+                <w:rFonts w:ascii="Consolas" w:cs="Consolas" w:eastAsia="Consolas" w:hAnsi="Consolas"/>
+                <w:sz w:val="20"/>
+                <w:szCs w:val="20"/>
+                <w:highlight w:val="lightGray"/>
+                <w:highlightCs w:val="lightGray"/>
+              </w:rPr>
+              <w:t xml:space="preserve">count</w:t>
+            </w:r>
+            <w:r>
+              <w:t xml:space="preserve"> of the most recent lines, oldest-to-newest, reading backward through older rotated files if the current day's file doesn't have enough on its own. Backs the Settings page's 500-line viewer.</w:t>
+            </w:r>
+          </w:p>
+        </w:tc>
+      </w:tr>
+      <w:tr>
+        <w:tc>
+          <w:tcPr>
+            <w:tcMar>
+              <w:top w:type="dxa" w:w="60"/>
+              <w:left w:type="dxa" w:w="80"/>
+              <w:bottom w:type="dxa" w:w="60"/>
+              <w:right w:type="dxa" w:w="80"/>
+            </w:tcMar>
+          </w:tcPr>
+          <w:p>
+            <w:r>
+              <w:rPr>
+                <w:rFonts w:ascii="Consolas" w:cs="Consolas" w:eastAsia="Consolas" w:hAnsi="Consolas"/>
+                <w:sz w:val="20"/>
+                <w:szCs w:val="20"/>
+                <w:highlight w:val="lightGray"/>
+                <w:highlightCs w:val="lightGray"/>
+              </w:rPr>
+              <w:t xml:space="preserve">ListLogFiles</w:t>
+            </w:r>
+          </w:p>
+        </w:tc>
+        <w:tc>
+          <w:tcPr>
+            <w:tcMar>
+              <w:top w:type="dxa" w:w="60"/>
+              <w:left w:type="dxa" w:w="80"/>
+              <w:bottom w:type="dxa" w:w="60"/>
+              <w:right w:type="dxa" w:w="80"/>
+            </w:tcMar>
+          </w:tcPr>
+          <w:p>
+            <w:r>
+              <w:rPr>
+                <w:rFonts w:ascii="Consolas" w:cs="Consolas" w:eastAsia="Consolas" w:hAnsi="Consolas"/>
+                <w:sz w:val="20"/>
+                <w:szCs w:val="20"/>
+                <w:highlight w:val="lightGray"/>
+                <w:highlightCs w:val="lightGray"/>
+              </w:rPr>
+              <w:t xml:space="preserve">List&lt;string&gt; ListLogFiles()</w:t>
+            </w:r>
+          </w:p>
+        </w:tc>
+        <w:tc>
+          <w:tcPr>
+            <w:tcMar>
+              <w:top w:type="dxa" w:w="60"/>
+              <w:left w:type="dxa" w:w="80"/>
+              <w:bottom w:type="dxa" w:w="60"/>
+              <w:right w:type="dxa" w:w="80"/>
+            </w:tcMar>
+          </w:tcPr>
+          <w:p>
+            <w:r>
+              <w:t xml:space="preserve">Every rotated log file, newest first. Used by </w:t>
+            </w:r>
+            <w:r>
+              <w:rPr>
+                <w:rFonts w:ascii="Consolas" w:cs="Consolas" w:eastAsia="Consolas" w:hAnsi="Consolas"/>
+                <w:sz w:val="20"/>
+                <w:szCs w:val="20"/>
+                <w:highlight w:val="lightGray"/>
+                <w:highlightCs w:val="lightGray"/>
+              </w:rPr>
+              <w:t xml:space="preserve">GET /settings/logs/download</w:t>
+            </w:r>
+            <w:r>
+              <w:t xml:space="preserve"> to build the zip.</w:t>
+            </w:r>
+          </w:p>
+        </w:tc>
+      </w:tr>
+      <w:tr>
+        <w:tc>
+          <w:tcPr>
+            <w:tcMar>
+              <w:top w:type="dxa" w:w="60"/>
+              <w:left w:type="dxa" w:w="80"/>
+              <w:bottom w:type="dxa" w:w="60"/>
+              <w:right w:type="dxa" w:w="80"/>
+            </w:tcMar>
+          </w:tcPr>
+          <w:p>
+            <w:r>
+              <w:rPr>
+                <w:rFonts w:ascii="Consolas" w:cs="Consolas" w:eastAsia="Consolas" w:hAnsi="Consolas"/>
+                <w:sz w:val="20"/>
+                <w:szCs w:val="20"/>
+                <w:highlight w:val="lightGray"/>
+                <w:highlightCs w:val="lightGray"/>
+              </w:rPr>
+              <w:t xml:space="preserve">CurrentLevel</w:t>
+            </w:r>
+            <w:r>
+              <w:t xml:space="preserve"> / </w:t>
+            </w:r>
+            <w:r>
+              <w:rPr>
+                <w:rFonts w:ascii="Consolas" w:cs="Consolas" w:eastAsia="Consolas" w:hAnsi="Consolas"/>
+                <w:sz w:val="20"/>
+                <w:szCs w:val="20"/>
+                <w:highlight w:val="lightGray"/>
+                <w:highlightCs w:val="lightGray"/>
+              </w:rPr>
+              <w:t xml:space="preserve">LogDirectory</w:t>
+            </w:r>
+          </w:p>
+        </w:tc>
+        <w:tc>
+          <w:tcPr>
+            <w:tcMar>
+              <w:top w:type="dxa" w:w="60"/>
+              <w:left w:type="dxa" w:w="80"/>
+              <w:bottom w:type="dxa" w:w="60"/>
+              <w:right w:type="dxa" w:w="80"/>
+            </w:tcMar>
+          </w:tcPr>
+          <w:p>
+            <w:r>
+              <w:rPr>
+                <w:rFonts w:ascii="Consolas" w:cs="Consolas" w:eastAsia="Consolas" w:hAnsi="Consolas"/>
+                <w:sz w:val="20"/>
+                <w:szCs w:val="20"/>
+                <w:highlight w:val="lightGray"/>
+                <w:highlightCs w:val="lightGray"/>
+              </w:rPr>
+              <w:t xml:space="preserve">AppLogLevel CurrentLevel { get; }</w:t>
+            </w:r>
+            <w:r>
+              <w:t xml:space="preserve"> / </w:t>
+            </w:r>
+            <w:r>
+              <w:rPr>
+                <w:rFonts w:ascii="Consolas" w:cs="Consolas" w:eastAsia="Consolas" w:hAnsi="Consolas"/>
+                <w:sz w:val="20"/>
+                <w:szCs w:val="20"/>
+                <w:highlight w:val="lightGray"/>
+                <w:highlightCs w:val="lightGray"/>
+              </w:rPr>
+              <w:t xml:space="preserve">string LogDirectory { get; }</w:t>
+            </w:r>
+          </w:p>
+        </w:tc>
+        <w:tc>
+          <w:tcPr>
+            <w:tcMar>
+              <w:top w:type="dxa" w:w="60"/>
+              <w:left w:type="dxa" w:w="80"/>
+              <w:bottom w:type="dxa" w:w="60"/>
+              <w:right w:type="dxa" w:w="80"/>
+            </w:tcMar>
+          </w:tcPr>
+          <w:p>
+            <w:r>
+              <w:t xml:space="preserve">Current level and the resolved log directory path (after the </w:t>
+            </w:r>
+            <w:r>
+              <w:rPr>
+                <w:rFonts w:ascii="Consolas" w:cs="Consolas" w:eastAsia="Consolas" w:hAnsi="Consolas"/>
+                <w:sz w:val="20"/>
+                <w:szCs w:val="20"/>
+                <w:highlight w:val="lightGray"/>
+                <w:highlightCs w:val="lightGray"/>
+              </w:rPr>
+              <w:t xml:space="preserve">AppLog:LogDirectory</w:t>
+            </w:r>
+            <w:r>
+              <w:t xml:space="preserve"> fallback, if unset - see the deployment guide).</w:t>
+            </w:r>
+          </w:p>
+        </w:tc>
+      </w:tr>
+    </w:tbl>
+    <w:p/>
+    <w:p>
+      <w:pPr>
+        <w:spacing w:after="160"/>
+      </w:pPr>
+      <w:r>
+        <w:t xml:space="preserve">Log lines are single-line, space-separated </w:t>
+      </w:r>
+      <w:r>
+        <w:rPr>
+          <w:rFonts w:ascii="Consolas" w:cs="Consolas" w:eastAsia="Consolas" w:hAnsi="Consolas"/>
+          <w:sz w:val="20"/>
+          <w:szCs w:val="20"/>
+          <w:highlight w:val="lightGray"/>
+          <w:highlightCs w:val="lightGray"/>
+        </w:rPr>
+        <w:t xml:space="preserve">key=value</w:t>
+      </w:r>
+      <w:r>
+        <w:t xml:space="preserve"> pairs (timestamp, tier, </w:t>
+      </w:r>
+      <w:r>
+        <w:rPr>
+          <w:rFonts w:ascii="Consolas" w:cs="Consolas" w:eastAsia="Consolas" w:hAnsi="Consolas"/>
+          <w:sz w:val="20"/>
+          <w:szCs w:val="20"/>
+          <w:highlight w:val="lightGray"/>
+          <w:highlightCs w:val="lightGray"/>
+        </w:rPr>
+        <w:t xml:space="preserve">action</w:t>
+      </w:r>
+      <w:r>
+        <w:t xml:space="preserve">, </w:t>
+      </w:r>
+      <w:r>
+        <w:rPr>
+          <w:rFonts w:ascii="Consolas" w:cs="Consolas" w:eastAsia="Consolas" w:hAnsi="Consolas"/>
+          <w:sz w:val="20"/>
+          <w:szCs w:val="20"/>
+          <w:highlight w:val="lightGray"/>
+          <w:highlightCs w:val="lightGray"/>
+        </w:rPr>
+        <w:t xml:space="preserve">actor</w:t>
+      </w:r>
+      <w:r>
+        <w:t xml:space="preserve">,
+optionally </w:t>
+      </w:r>
+      <w:r>
+        <w:rPr>
+          <w:rFonts w:ascii="Consolas" w:cs="Consolas" w:eastAsia="Consolas" w:hAnsi="Consolas"/>
+          <w:sz w:val="20"/>
+          <w:szCs w:val="20"/>
+          <w:highlight w:val="lightGray"/>
+          <w:highlightCs w:val="lightGray"/>
+        </w:rPr>
+        <w:t xml:space="preserve">eventId</w:t>
+      </w:r>
+      <w:r>
+        <w:t xml:space="preserve">/</w:t>
+      </w:r>
+      <w:r>
+        <w:rPr>
+          <w:rFonts w:ascii="Consolas" w:cs="Consolas" w:eastAsia="Consolas" w:hAnsi="Consolas"/>
+          <w:sz w:val="20"/>
+          <w:szCs w:val="20"/>
+          <w:highlight w:val="lightGray"/>
+          <w:highlightCs w:val="lightGray"/>
+        </w:rPr>
+        <w:t xml:space="preserve">sheet</w:t>
+      </w:r>
+      <w:r>
+        <w:t xml:space="preserve">/</w:t>
+      </w:r>
+      <w:r>
+        <w:rPr>
+          <w:rFonts w:ascii="Consolas" w:cs="Consolas" w:eastAsia="Consolas" w:hAnsi="Consolas"/>
+          <w:sz w:val="20"/>
+          <w:szCs w:val="20"/>
+          <w:highlight w:val="lightGray"/>
+          <w:highlightCs w:val="lightGray"/>
+        </w:rPr>
+        <w:t xml:space="preserve">details</w:t>
+      </w:r>
+      <w:r>
+        <w:t xml:space="preserve">) - human-readable and grep-able, not JSON. Files rotate daily
+(</w:t>
+      </w:r>
+      <w:r>
+        <w:rPr>
+          <w:rFonts w:ascii="Consolas" w:cs="Consolas" w:eastAsia="Consolas" w:hAnsi="Consolas"/>
+          <w:sz w:val="20"/>
+          <w:szCs w:val="20"/>
+          <w:highlight w:val="lightGray"/>
+          <w:highlightCs w:val="lightGray"/>
+        </w:rPr>
+        <w:t xml:space="preserve">app-yyyy-MM-dd.log</w:t>
+      </w:r>
+      <w:r>
+        <w:t xml:space="preserve">) and are deleted automatically past </w:t>
+      </w:r>
+      <w:r>
+        <w:rPr>
+          <w:rFonts w:ascii="Consolas" w:cs="Consolas" w:eastAsia="Consolas" w:hAnsi="Consolas"/>
+          <w:sz w:val="20"/>
+          <w:szCs w:val="20"/>
+          <w:highlight w:val="lightGray"/>
+          <w:highlightCs w:val="lightGray"/>
+        </w:rPr>
+        <w:t xml:space="preserve">AppLog:RetentionDays</w:t>
+      </w:r>
+      <w:r>
+        <w:t xml:space="preserve"> (default 30).</w:t>
       </w:r>
     </w:p>
     <w:sectPr>

</xml_diff>